<commit_message>
cap nhat doc slot 1
</commit_message>
<xml_diff>
--- a/Slot1/Exsercise 1.docx
+++ b/Slot1/Exsercise 1.docx
@@ -1200,6 +1200,7 @@
           <w:ilvl w:val="0"/>
           <w:numId w:val="1"/>
         </w:numPr>
+        <w:ind w:left="567"/>
       </w:pPr>
       <w:r>
         <w:lastRenderedPageBreak/>
@@ -2119,6 +2120,7 @@
           <w:ilvl w:val="0"/>
           <w:numId w:val="1"/>
         </w:numPr>
+        <w:ind w:left="567"/>
       </w:pPr>
       <w:bookmarkStart w:id="4" w:name="_Toc229428698"/>
       <w:r>
@@ -3100,6 +3102,7 @@
     <w:p>
       <w:pPr>
         <w:pStyle w:val="ListParagraph"/>
+        <w:ind w:firstLine="0"/>
       </w:pPr>
       <w:r>
         <w:t xml:space="preserve">Ta </w:t>
@@ -3351,6 +3354,7 @@
     <w:p>
       <w:pPr>
         <w:pStyle w:val="ListParagraph"/>
+        <w:ind w:firstLine="0"/>
       </w:pPr>
       <w:proofErr w:type="spellStart"/>
       <w:r>
@@ -3526,6 +3530,7 @@
           <w:ilvl w:val="0"/>
           <w:numId w:val="1"/>
         </w:numPr>
+        <w:ind w:left="567"/>
       </w:pPr>
       <w:bookmarkStart w:id="10" w:name="_Toc229428701"/>
       <w:proofErr w:type="spellStart"/>

</xml_diff>